<commit_message>
Added diagramas y reglas de transicion
</commit_message>
<xml_diff>
--- a/Manual de Usuario.docx
+++ b/Manual de Usuario.docx
@@ -10,7 +10,7 @@
       </w:pPr>
       <w:r>
         <w:rPr>
-          <w:noProof/>
+          <w:lang w:val="es-MX"/>
         </w:rPr>
         <w:drawing>
           <wp:inline distT="0" distB="0" distL="0" distR="0" wp14:anchorId="6A33D1D8" wp14:editId="249E7841">
@@ -69,7 +69,7 @@
       </w:r>
       <w:r>
         <w:rPr>
-          <w:noProof/>
+          <w:lang w:val="es-MX"/>
         </w:rPr>
         <w:drawing>
           <wp:inline distT="0" distB="0" distL="0" distR="0" wp14:anchorId="2993C4E6" wp14:editId="69B4E4F7">
@@ -158,17 +158,7 @@
           <w:szCs w:val="36"/>
           <w:lang w:val="es-MX"/>
         </w:rPr>
-        <w:t>8 de mayo</w:t>
-      </w:r>
-      <w:r>
-        <w:rPr>
-          <w:b/>
-          <w:bCs/>
-          <w:sz w:val="36"/>
-          <w:szCs w:val="36"/>
-          <w:lang w:val="es-MX"/>
-        </w:rPr>
-        <w:t xml:space="preserve"> de 2026 </w:t>
+        <w:t xml:space="preserve">8 de mayo de 2026 </w:t>
       </w:r>
     </w:p>
     <w:p>
@@ -508,26 +498,722 @@
           <w:bCs/>
           <w:sz w:val="28"/>
           <w:szCs w:val="28"/>
-        </w:rPr>
-      </w:pPr>
-      <w:proofErr w:type="spellStart"/>
+          <w:lang w:val="es-MX"/>
+        </w:rPr>
+      </w:pPr>
       <w:r>
         <w:rPr>
           <w:b/>
           <w:bCs/>
           <w:sz w:val="28"/>
           <w:szCs w:val="28"/>
+          <w:lang w:val="es-MX"/>
         </w:rPr>
         <w:lastRenderedPageBreak/>
-        <w:t>Objetivo</w:t>
+        <w:t xml:space="preserve">Reglas de </w:t>
+      </w:r>
+      <w:r>
+        <w:rPr>
+          <w:b/>
+          <w:bCs/>
+          <w:sz w:val="28"/>
+          <w:szCs w:val="28"/>
+          <w:lang w:val="es-MX"/>
+        </w:rPr>
+        <w:t>transición</w:t>
+      </w:r>
+    </w:p>
+    <w:p>
+      <w:pPr>
+        <w:rPr>
+          <w:sz w:val="24"/>
+          <w:szCs w:val="24"/>
+          <w:lang w:val="es-MX"/>
+        </w:rPr>
+        <w:sectPr>
+          <w:pgSz w:w="12240" w:h="15840"/>
+          <w:pgMar w:top="1440" w:right="1440" w:bottom="1440" w:left="1440" w:header="720" w:footer="720" w:gutter="0"/>
+          <w:pgBorders w:offsetFrom="page">
+            <w:top w:val="single" w:sz="4" w:space="24" w:color="auto"/>
+            <w:left w:val="single" w:sz="4" w:space="24" w:color="auto"/>
+            <w:bottom w:val="single" w:sz="4" w:space="24" w:color="auto"/>
+            <w:right w:val="single" w:sz="4" w:space="24" w:color="auto"/>
+          </w:pgBorders>
+          <w:cols w:space="720"/>
+          <w:docGrid w:linePitch="360"/>
+        </w:sectPr>
+      </w:pPr>
+    </w:p>
+    <w:p>
+      <w:pPr>
+        <w:rPr>
+          <w:sz w:val="24"/>
+          <w:szCs w:val="24"/>
+          <w:lang w:val="es-MX"/>
+        </w:rPr>
+      </w:pPr>
+      <w:r>
+        <w:rPr>
+          <w:sz w:val="24"/>
+          <w:szCs w:val="24"/>
+          <w:lang w:val="es-MX"/>
+        </w:rPr>
+        <w:t>δ (q0, ƀ) = (q1, ƀ, R)</w:t>
+      </w:r>
+    </w:p>
+    <w:p>
+      <w:pPr>
+        <w:rPr>
+          <w:sz w:val="24"/>
+          <w:szCs w:val="24"/>
+          <w:lang w:val="es-MX"/>
+        </w:rPr>
+      </w:pPr>
+      <w:r>
+        <w:rPr>
+          <w:sz w:val="24"/>
+          <w:szCs w:val="24"/>
+          <w:lang w:val="es-MX"/>
+        </w:rPr>
+        <w:t>δ (q1, a) = (q2, x, L)</w:t>
+      </w:r>
+    </w:p>
+    <w:p>
+      <w:pPr>
+        <w:rPr>
+          <w:sz w:val="24"/>
+          <w:szCs w:val="24"/>
+          <w:lang w:val="es-MX"/>
+        </w:rPr>
+      </w:pPr>
+      <w:r>
+        <w:rPr>
+          <w:sz w:val="24"/>
+          <w:szCs w:val="24"/>
+          <w:lang w:val="es-MX"/>
+        </w:rPr>
+        <w:t>δ (q1, b) = (q2, x, L)</w:t>
+      </w:r>
+    </w:p>
+    <w:p>
+      <w:pPr>
+        <w:rPr>
+          <w:sz w:val="24"/>
+          <w:szCs w:val="24"/>
+          <w:lang w:val="es-MX"/>
+        </w:rPr>
+      </w:pPr>
+      <w:r>
+        <w:rPr>
+          <w:sz w:val="24"/>
+          <w:szCs w:val="24"/>
+          <w:lang w:val="es-MX"/>
+        </w:rPr>
+        <w:t>δ (q2, ƀ) = (q2, ƀ, R)</w:t>
+      </w:r>
+    </w:p>
+    <w:p>
+      <w:pPr>
+        <w:rPr>
+          <w:sz w:val="24"/>
+          <w:szCs w:val="24"/>
+          <w:lang w:val="es-MX"/>
+        </w:rPr>
+      </w:pPr>
+      <w:r>
+        <w:rPr>
+          <w:sz w:val="24"/>
+          <w:szCs w:val="24"/>
+          <w:lang w:val="es-MX"/>
+        </w:rPr>
+        <w:t>δ (q2, x) = (q3, y, R)</w:t>
+      </w:r>
+    </w:p>
+    <w:p>
+      <w:pPr>
+        <w:rPr>
+          <w:sz w:val="24"/>
+          <w:szCs w:val="24"/>
+          <w:lang w:val="es-MX"/>
+        </w:rPr>
+      </w:pPr>
+      <w:r>
+        <w:rPr>
+          <w:sz w:val="24"/>
+          <w:szCs w:val="24"/>
+          <w:lang w:val="es-MX"/>
+        </w:rPr>
+        <w:t>δ (q2, z) = (q5, z, L)</w:t>
+      </w:r>
+    </w:p>
+    <w:p>
+      <w:pPr>
+        <w:rPr>
+          <w:sz w:val="24"/>
+          <w:szCs w:val="24"/>
+          <w:lang w:val="es-MX"/>
+        </w:rPr>
+      </w:pPr>
+      <w:r>
+        <w:rPr>
+          <w:sz w:val="24"/>
+          <w:szCs w:val="24"/>
+          <w:lang w:val="es-MX"/>
+        </w:rPr>
+        <w:t>δ (q3, x</w:t>
+      </w:r>
+      <w:r>
+        <w:rPr>
+          <w:sz w:val="24"/>
+          <w:szCs w:val="24"/>
+          <w:lang w:val="es-MX"/>
+        </w:rPr>
+        <w:t>) =</w:t>
+      </w:r>
+      <w:r>
+        <w:rPr>
+          <w:sz w:val="24"/>
+          <w:szCs w:val="24"/>
+          <w:lang w:val="es-MX"/>
+        </w:rPr>
+        <w:t xml:space="preserve"> (q3</w:t>
+      </w:r>
+      <w:r>
+        <w:rPr>
+          <w:sz w:val="24"/>
+          <w:szCs w:val="24"/>
+          <w:lang w:val="es-MX"/>
+        </w:rPr>
+        <w:t xml:space="preserve">, </w:t>
+      </w:r>
+      <w:r>
+        <w:rPr>
+          <w:sz w:val="24"/>
+          <w:szCs w:val="24"/>
+          <w:lang w:val="es-MX"/>
+        </w:rPr>
+        <w:t>x</w:t>
+      </w:r>
+      <w:r>
+        <w:rPr>
+          <w:sz w:val="24"/>
+          <w:szCs w:val="24"/>
+          <w:lang w:val="es-MX"/>
+        </w:rPr>
+        <w:t xml:space="preserve">, </w:t>
+      </w:r>
+      <w:r>
+        <w:rPr>
+          <w:sz w:val="24"/>
+          <w:szCs w:val="24"/>
+          <w:lang w:val="es-MX"/>
+        </w:rPr>
+        <w:t>R)</w:t>
+      </w:r>
+    </w:p>
+    <w:p>
+      <w:pPr>
+        <w:rPr>
+          <w:sz w:val="24"/>
+          <w:szCs w:val="24"/>
+          <w:lang w:val="es-MX"/>
+        </w:rPr>
+      </w:pPr>
+      <w:r>
+        <w:rPr>
+          <w:sz w:val="24"/>
+          <w:szCs w:val="24"/>
+          <w:lang w:val="es-MX"/>
+        </w:rPr>
+        <w:t>δ (q3, z) = (q3, z, R)</w:t>
+      </w:r>
+    </w:p>
+    <w:p>
+      <w:pPr>
+        <w:rPr>
+          <w:sz w:val="24"/>
+          <w:szCs w:val="24"/>
+          <w:lang w:val="es-MX"/>
+        </w:rPr>
+      </w:pPr>
+      <w:r>
+        <w:rPr>
+          <w:sz w:val="24"/>
+          <w:szCs w:val="24"/>
+          <w:lang w:val="es-MX"/>
+        </w:rPr>
+        <w:t>δ (q3, a) = (q4, z, L)</w:t>
+      </w:r>
+    </w:p>
+    <w:p>
+      <w:pPr>
+        <w:rPr>
+          <w:sz w:val="24"/>
+          <w:szCs w:val="24"/>
+          <w:lang w:val="es-MX"/>
+        </w:rPr>
+      </w:pPr>
+      <w:r>
+        <w:rPr>
+          <w:sz w:val="24"/>
+          <w:szCs w:val="24"/>
+          <w:lang w:val="es-MX"/>
+        </w:rPr>
+        <w:t>δ (q3, b) = (q4, z, L)</w:t>
+      </w:r>
+    </w:p>
+    <w:p>
+      <w:pPr>
+        <w:rPr>
+          <w:sz w:val="24"/>
+          <w:szCs w:val="24"/>
+          <w:lang w:val="es-MX"/>
+        </w:rPr>
+      </w:pPr>
+      <w:r>
+        <w:rPr>
+          <w:sz w:val="24"/>
+          <w:szCs w:val="24"/>
+          <w:lang w:val="es-MX"/>
+        </w:rPr>
+        <w:t>δ (q4, z) = (q4, z, L)</w:t>
+      </w:r>
+    </w:p>
+    <w:p>
+      <w:pPr>
+        <w:rPr>
+          <w:sz w:val="24"/>
+          <w:szCs w:val="24"/>
+          <w:lang w:val="es-MX"/>
+        </w:rPr>
+      </w:pPr>
+      <w:r>
+        <w:rPr>
+          <w:sz w:val="24"/>
+          <w:szCs w:val="24"/>
+          <w:lang w:val="es-MX"/>
+        </w:rPr>
+        <w:t>δ (q4, x) = (q4, x, L)</w:t>
+      </w:r>
+    </w:p>
+    <w:p>
+      <w:pPr>
+        <w:rPr>
+          <w:sz w:val="24"/>
+          <w:szCs w:val="24"/>
+          <w:lang w:val="es-MX"/>
+        </w:rPr>
+      </w:pPr>
+    </w:p>
+    <w:p>
+      <w:pPr>
+        <w:rPr>
+          <w:sz w:val="24"/>
+          <w:szCs w:val="24"/>
+          <w:lang w:val="es-MX"/>
+        </w:rPr>
+      </w:pPr>
+      <w:r>
+        <w:rPr>
+          <w:sz w:val="24"/>
+          <w:szCs w:val="24"/>
+          <w:lang w:val="es-MX"/>
+        </w:rPr>
+        <w:t>δ (q4, y) = (q2, y, R)</w:t>
+      </w:r>
+    </w:p>
+    <w:p>
+      <w:pPr>
+        <w:rPr>
+          <w:sz w:val="24"/>
+          <w:szCs w:val="24"/>
+          <w:lang w:val="es-MX"/>
+        </w:rPr>
+      </w:pPr>
+      <w:r>
+        <w:rPr>
+          <w:sz w:val="24"/>
+          <w:szCs w:val="24"/>
+          <w:lang w:val="es-MX"/>
+        </w:rPr>
+        <w:t>δ (q5, y) = (q5, y, L)</w:t>
+      </w:r>
+    </w:p>
+    <w:p>
+      <w:pPr>
+        <w:rPr>
+          <w:sz w:val="24"/>
+          <w:szCs w:val="24"/>
+          <w:lang w:val="es-MX"/>
+        </w:rPr>
+      </w:pPr>
+      <w:r>
+        <w:rPr>
+          <w:sz w:val="24"/>
+          <w:szCs w:val="24"/>
+          <w:lang w:val="es-MX"/>
+        </w:rPr>
+        <w:t>δ (q5, ƀ) = (q6, ƀ, R)</w:t>
+      </w:r>
+    </w:p>
+    <w:p>
+      <w:pPr>
+        <w:rPr>
+          <w:sz w:val="24"/>
+          <w:szCs w:val="24"/>
+          <w:lang w:val="es-MX"/>
+        </w:rPr>
+      </w:pPr>
+      <w:r>
+        <w:rPr>
+          <w:sz w:val="24"/>
+          <w:szCs w:val="24"/>
+          <w:lang w:val="es-MX"/>
+        </w:rPr>
+        <w:t>δ (q6, y) = (q6, x, R)</w:t>
+      </w:r>
+    </w:p>
+    <w:p>
+      <w:pPr>
+        <w:rPr>
+          <w:sz w:val="24"/>
+          <w:szCs w:val="24"/>
+          <w:lang w:val="es-MX"/>
+        </w:rPr>
+      </w:pPr>
+      <w:r>
+        <w:rPr>
+          <w:sz w:val="24"/>
+          <w:szCs w:val="24"/>
+          <w:lang w:val="es-MX"/>
+        </w:rPr>
+        <w:t>δ (q6, z) = (q6, x, R)</w:t>
+      </w:r>
+    </w:p>
+    <w:p>
+      <w:pPr>
+        <w:rPr>
+          <w:sz w:val="24"/>
+          <w:szCs w:val="24"/>
+          <w:lang w:val="es-MX"/>
+        </w:rPr>
+      </w:pPr>
+      <w:r>
+        <w:rPr>
+          <w:sz w:val="24"/>
+          <w:szCs w:val="24"/>
+          <w:lang w:val="es-MX"/>
+        </w:rPr>
+        <w:t>δ (q6, a) = (q7, a, L)</w:t>
+      </w:r>
+    </w:p>
+    <w:p>
+      <w:pPr>
+        <w:rPr>
+          <w:sz w:val="24"/>
+          <w:szCs w:val="24"/>
+          <w:lang w:val="es-MX"/>
+        </w:rPr>
+      </w:pPr>
+      <w:r>
+        <w:rPr>
+          <w:sz w:val="24"/>
+          <w:szCs w:val="24"/>
+          <w:lang w:val="es-MX"/>
+        </w:rPr>
+        <w:t>δ (q6, b) = (q7, b, L)</w:t>
+      </w:r>
+    </w:p>
+    <w:p>
+      <w:pPr>
+        <w:rPr>
+          <w:sz w:val="24"/>
+          <w:szCs w:val="24"/>
+          <w:lang w:val="es-MX"/>
+        </w:rPr>
+      </w:pPr>
+      <w:r>
+        <w:rPr>
+          <w:sz w:val="24"/>
+          <w:szCs w:val="24"/>
+          <w:lang w:val="es-MX"/>
+        </w:rPr>
+        <w:t>δ (q6, ƀ) = (q8, ƀ, L)</w:t>
+      </w:r>
+    </w:p>
+    <w:p>
+      <w:pPr>
+        <w:rPr>
+          <w:sz w:val="24"/>
+          <w:szCs w:val="24"/>
+          <w:lang w:val="es-MX"/>
+        </w:rPr>
+      </w:pPr>
+      <w:r>
+        <w:rPr>
+          <w:sz w:val="24"/>
+          <w:szCs w:val="24"/>
+          <w:lang w:val="es-MX"/>
+        </w:rPr>
+        <w:t>δ (q7, x) = (q7, x, L)</w:t>
+      </w:r>
+    </w:p>
+    <w:p>
+      <w:pPr>
+        <w:rPr>
+          <w:sz w:val="24"/>
+          <w:szCs w:val="24"/>
+          <w:lang w:val="es-MX"/>
+        </w:rPr>
+      </w:pPr>
+      <w:r>
+        <w:rPr>
+          <w:sz w:val="24"/>
+          <w:szCs w:val="24"/>
+          <w:lang w:val="es-MX"/>
+        </w:rPr>
+        <w:t>δ (q7, ƀ) = (q2, ƀ, R)</w:t>
+      </w:r>
+    </w:p>
+    <w:p>
+      <w:pPr>
+        <w:rPr>
+          <w:sz w:val="24"/>
+          <w:szCs w:val="24"/>
+          <w:lang w:val="es-MX"/>
+        </w:rPr>
+      </w:pPr>
+      <w:r>
+        <w:rPr>
+          <w:sz w:val="24"/>
+          <w:szCs w:val="24"/>
+          <w:lang w:val="es-MX"/>
+        </w:rPr>
+        <w:t>δ (q8, x) = (q8, ƀ, L)</w:t>
+      </w:r>
+    </w:p>
+    <w:p>
+      <w:pPr>
+        <w:rPr>
+          <w:sz w:val="24"/>
+          <w:szCs w:val="24"/>
+          <w:lang w:val="es-MX"/>
+        </w:rPr>
+        <w:sectPr>
+          <w:type w:val="continuous"/>
+          <w:pgSz w:w="12240" w:h="15840"/>
+          <w:pgMar w:top="1440" w:right="1440" w:bottom="1440" w:left="1440" w:header="720" w:footer="720" w:gutter="0"/>
+          <w:pgBorders w:offsetFrom="page">
+            <w:top w:val="single" w:sz="4" w:space="24" w:color="auto"/>
+            <w:left w:val="single" w:sz="4" w:space="24" w:color="auto"/>
+            <w:bottom w:val="single" w:sz="4" w:space="24" w:color="auto"/>
+            <w:right w:val="single" w:sz="4" w:space="24" w:color="auto"/>
+          </w:pgBorders>
+          <w:cols w:num="2" w:space="720"/>
+          <w:docGrid w:linePitch="360"/>
+        </w:sectPr>
+      </w:pPr>
+      <w:r>
+        <w:rPr>
+          <w:sz w:val="24"/>
+          <w:szCs w:val="24"/>
+          <w:lang w:val="es-MX"/>
+        </w:rPr>
+        <w:t>δ (q8, ƀ) = (</w:t>
+      </w:r>
+      <w:proofErr w:type="spellStart"/>
+      <w:r>
+        <w:rPr>
+          <w:sz w:val="24"/>
+          <w:szCs w:val="24"/>
+          <w:lang w:val="es-MX"/>
+        </w:rPr>
+        <w:t>qf</w:t>
       </w:r>
       <w:proofErr w:type="spellEnd"/>
-    </w:p>
-    <w:p>
-      <w:pPr>
-        <w:rPr>
-          <w:b/>
-          <w:bCs/>
+      <w:r>
+        <w:rPr>
+          <w:sz w:val="24"/>
+          <w:szCs w:val="24"/>
+          <w:lang w:val="es-MX"/>
+        </w:rPr>
+        <w:t>, ƀ, S)</w:t>
+      </w:r>
+    </w:p>
+    <w:p>
+      <w:pPr>
+        <w:rPr>
+          <w:b/>
+          <w:bCs/>
+          <w:sz w:val="28"/>
+          <w:szCs w:val="28"/>
+          <w:lang w:val="es-MX"/>
+        </w:rPr>
+      </w:pPr>
+      <w:r>
+        <w:rPr>
+          <w:b/>
+          <w:bCs/>
+          <w:sz w:val="28"/>
+          <w:szCs w:val="28"/>
+          <w:lang w:val="es-MX"/>
+        </w:rPr>
+        <w:t>Diagrama</w:t>
+      </w:r>
+    </w:p>
+    <w:p>
+      <w:pPr>
+        <w:rPr>
+          <w:sz w:val="24"/>
+          <w:szCs w:val="24"/>
+          <w:lang w:val="es-MX"/>
+        </w:rPr>
+      </w:pPr>
+      <w:r>
+        <w:rPr>
+          <w:noProof/>
+          <w:sz w:val="24"/>
+          <w:szCs w:val="24"/>
+          <w:lang w:val="es-MX"/>
+        </w:rPr>
+        <w:drawing>
+          <wp:inline distT="0" distB="0" distL="0" distR="0" wp14:anchorId="5EBFA5E9" wp14:editId="41D587C4">
+            <wp:extent cx="6126272" cy="2428875"/>
+            <wp:effectExtent l="0" t="0" r="8255" b="0"/>
+            <wp:docPr id="355696261" name="Picture 1"/>
+            <wp:cNvGraphicFramePr>
+              <a:graphicFrameLocks xmlns:a="http://schemas.openxmlformats.org/drawingml/2006/main" noChangeAspect="1"/>
+            </wp:cNvGraphicFramePr>
+            <a:graphic xmlns:a="http://schemas.openxmlformats.org/drawingml/2006/main">
+              <a:graphicData uri="http://schemas.openxmlformats.org/drawingml/2006/picture">
+                <pic:pic xmlns:pic="http://schemas.openxmlformats.org/drawingml/2006/picture">
+                  <pic:nvPicPr>
+                    <pic:cNvPr id="0" name="Picture 1"/>
+                    <pic:cNvPicPr>
+                      <a:picLocks noChangeAspect="1" noChangeArrowheads="1"/>
+                    </pic:cNvPicPr>
+                  </pic:nvPicPr>
+                  <pic:blipFill>
+                    <a:blip r:embed="rId6">
+                      <a:extLst>
+                        <a:ext uri="{28A0092B-C50C-407E-A947-70E740481C1C}">
+                          <a14:useLocalDpi xmlns:a14="http://schemas.microsoft.com/office/drawing/2010/main" val="0"/>
+                        </a:ext>
+                      </a:extLst>
+                    </a:blip>
+                    <a:srcRect/>
+                    <a:stretch>
+                      <a:fillRect/>
+                    </a:stretch>
+                  </pic:blipFill>
+                  <pic:spPr bwMode="auto">
+                    <a:xfrm>
+                      <a:off x="0" y="0"/>
+                      <a:ext cx="6139166" cy="2433987"/>
+                    </a:xfrm>
+                    <a:prstGeom prst="rect">
+                      <a:avLst/>
+                    </a:prstGeom>
+                    <a:noFill/>
+                    <a:ln>
+                      <a:noFill/>
+                    </a:ln>
+                  </pic:spPr>
+                </pic:pic>
+              </a:graphicData>
+            </a:graphic>
+          </wp:inline>
+        </w:drawing>
+      </w:r>
+    </w:p>
+    <w:p>
+      <w:pPr>
+        <w:rPr>
+          <w:b/>
+          <w:bCs/>
+          <w:sz w:val="28"/>
+          <w:szCs w:val="28"/>
+          <w:lang w:val="es-MX"/>
+        </w:rPr>
+      </w:pPr>
+    </w:p>
+    <w:p>
+      <w:pPr>
+        <w:rPr>
+          <w:b/>
+          <w:bCs/>
+          <w:sz w:val="28"/>
+          <w:szCs w:val="28"/>
+          <w:lang w:val="es-MX"/>
+        </w:rPr>
+      </w:pPr>
+    </w:p>
+    <w:p>
+      <w:pPr>
+        <w:rPr>
+          <w:b/>
+          <w:bCs/>
+          <w:sz w:val="28"/>
+          <w:szCs w:val="28"/>
+          <w:lang w:val="es-MX"/>
+        </w:rPr>
+      </w:pPr>
+    </w:p>
+    <w:p>
+      <w:pPr>
+        <w:rPr>
+          <w:b/>
+          <w:bCs/>
+          <w:sz w:val="28"/>
+          <w:szCs w:val="28"/>
+          <w:lang w:val="es-MX"/>
+        </w:rPr>
+      </w:pPr>
+      <w:r>
+        <w:rPr>
+          <w:b/>
+          <w:bCs/>
+          <w:sz w:val="28"/>
+          <w:szCs w:val="28"/>
+          <w:lang w:val="es-MX"/>
+        </w:rPr>
+        <w:lastRenderedPageBreak/>
+        <w:t>Configuraciones</w:t>
+      </w:r>
+    </w:p>
+    <w:p>
+      <w:pPr>
+        <w:rPr>
+          <w:sz w:val="24"/>
+          <w:szCs w:val="24"/>
+          <w:lang w:val="es-MX"/>
+        </w:rPr>
+      </w:pPr>
+    </w:p>
+    <w:p>
+      <w:pPr>
+        <w:rPr>
+          <w:b/>
+          <w:bCs/>
+          <w:sz w:val="28"/>
+          <w:szCs w:val="28"/>
+          <w:lang w:val="es-MX"/>
+        </w:rPr>
+      </w:pPr>
+      <w:r>
+        <w:rPr>
+          <w:b/>
+          <w:bCs/>
+          <w:sz w:val="28"/>
+          <w:szCs w:val="28"/>
+          <w:lang w:val="es-MX"/>
+        </w:rPr>
+        <w:t>Manual de usuario</w:t>
+      </w:r>
+    </w:p>
+    <w:p>
+      <w:pPr>
+        <w:rPr>
           <w:sz w:val="24"/>
           <w:szCs w:val="24"/>
           <w:lang w:val="es-MX"/>
@@ -535,6 +1221,7 @@
       </w:pPr>
     </w:p>
     <w:sectPr>
+      <w:type w:val="continuous"/>
       <w:pgSz w:w="12240" w:h="15840"/>
       <w:pgMar w:top="1440" w:right="1440" w:bottom="1440" w:left="1440" w:header="720" w:footer="720" w:gutter="0"/>
       <w:pgBorders w:offsetFrom="page">

</xml_diff>